<commit_message>
logbook and readme file upadate
</commit_message>
<xml_diff>
--- a/docs/BIT4107-Mobile Application Development Logbook (1).docx
+++ b/docs/BIT4107-Mobile Application Development Logbook (1).docx
@@ -12,7 +12,7 @@
           <w:u w:val="single"/>
         </w:rPr>
       </w:pPr>
-      <w:bookmarkStart w:id="0" w:name="_Toc1024480193"/>
+      <w:bookmarkStart w:id="0" w:name="_Toc1101732819"/>
       <w:r>
         <w:rPr>
           <w:sz w:val="52"/>
@@ -231,8 +231,8 @@
         <w:pStyle w:val="Normal"/>
         <w:rPr>
           <w:rFonts w:ascii="Times New Roman" w:hAnsi="Times New Roman" w:eastAsia="Times New Roman" w:cs="Times New Roman"/>
-          <w:b/>
-          <w:bCs/>
+          <w:b w:val="false"/>
+          <w:bCs w:val="false"/>
           <w:sz w:val="24"/>
           <w:szCs w:val="24"/>
           <w:lang w:val="en-US"/>
@@ -241,59 +241,12 @@
       <w:r>
         <w:rPr>
           <w:rFonts w:eastAsia="Times New Roman" w:cs="Times New Roman" w:ascii="Times New Roman" w:hAnsi="Times New Roman"/>
-          <w:b/>
-          <w:bCs/>
+          <w:b w:val="false"/>
+          <w:bCs w:val="false"/>
           <w:sz w:val="24"/>
           <w:szCs w:val="24"/>
           <w:lang w:val="en-US"/>
         </w:rPr>
-      </w:r>
-    </w:p>
-    <w:p>
-      <w:pPr>
-        <w:pStyle w:val="Normal"/>
-        <w:rPr>
-          <w:rFonts w:ascii="Times New Roman" w:hAnsi="Times New Roman" w:eastAsia="Times New Roman" w:cs="Times New Roman"/>
-          <w:b/>
-          <w:bCs/>
-          <w:sz w:val="24"/>
-          <w:szCs w:val="24"/>
-          <w:lang w:val="en-US"/>
-        </w:rPr>
-      </w:pPr>
-      <w:r>
-        <w:rPr>
-          <w:rFonts w:eastAsia="Times New Roman" w:cs="Times New Roman" w:ascii="Times New Roman" w:hAnsi="Times New Roman"/>
-          <w:b/>
-          <w:bCs/>
-          <w:sz w:val="24"/>
-          <w:szCs w:val="24"/>
-          <w:lang w:val="en-US"/>
-        </w:rPr>
-      </w:r>
-    </w:p>
-    <w:p>
-      <w:pPr>
-        <w:pStyle w:val="Normal"/>
-        <w:rPr>
-          <w:rFonts w:ascii="Times New Roman" w:hAnsi="Times New Roman" w:eastAsia="Times New Roman" w:cs="Times New Roman"/>
-          <w:b/>
-          <w:bCs/>
-          <w:sz w:val="40"/>
-          <w:szCs w:val="40"/>
-          <w:lang w:val="en-US"/>
-        </w:rPr>
-      </w:pPr>
-      <w:r>
-        <w:rPr>
-          <w:rFonts w:eastAsia="Times New Roman" w:cs="Times New Roman" w:ascii="Times New Roman" w:hAnsi="Times New Roman"/>
-          <w:b/>
-          <w:bCs/>
-          <w:sz w:val="40"/>
-          <w:szCs w:val="40"/>
-          <w:lang w:val="en-US"/>
-        </w:rPr>
-        <w:t>Table of contents</w:t>
       </w:r>
     </w:p>
     <w:sdt>
@@ -322,7 +275,6 @@
           <w:r>
             <w:rPr>
               <w:rStyle w:val="IndexLink"/>
-              <w:vanish w:val="false"/>
               <w:webHidden/>
             </w:rPr>
             <w:instrText xml:space="preserve"> TOC \z \o "1-9" \u \h</w:instrText>
@@ -330,43 +282,35 @@
           <w:r>
             <w:rPr>
               <w:rStyle w:val="IndexLink"/>
-              <w:vanish w:val="false"/>
               <w:webHidden/>
             </w:rPr>
             <w:fldChar w:fldCharType="separate"/>
           </w:r>
-          <w:hyperlink w:anchor="_Toc1024480193">
+          <w:hyperlink w:anchor="_Toc1101732819">
+            <w:r>
+              <w:rPr>
+                <w:webHidden/>
+              </w:rPr>
+              <w:fldChar w:fldCharType="begin"/>
+            </w:r>
+            <w:r>
+              <w:rPr>
+                <w:webHidden/>
+              </w:rPr>
+              <w:instrText xml:space="preserve">PAGEREF _Toc1101732819 \h</w:instrText>
+            </w:r>
+            <w:r>
+              <w:rPr>
+                <w:webHidden/>
+              </w:rPr>
+              <w:fldChar w:fldCharType="separate"/>
+            </w:r>
             <w:r>
               <w:rPr>
                 <w:rStyle w:val="IndexLink"/>
-                <w:vanish w:val="false"/>
                 <w:webHidden/>
               </w:rPr>
               <w:t>BIT4107-Mobile Application Development</w:t>
-            </w:r>
-            <w:r>
-              <w:rPr>
-                <w:webHidden/>
-              </w:rPr>
-              <w:fldChar w:fldCharType="begin"/>
-            </w:r>
-            <w:r>
-              <w:rPr>
-                <w:webHidden/>
-              </w:rPr>
-              <w:instrText xml:space="preserve">PAGEREF _Toc1024480193 \h</w:instrText>
-            </w:r>
-            <w:r>
-              <w:rPr>
-                <w:webHidden/>
-              </w:rPr>
-              <w:fldChar w:fldCharType="separate"/>
-            </w:r>
-            <w:r>
-              <w:rPr>
-                <w:rStyle w:val="IndexLink"/>
-                <w:vanish w:val="false"/>
-              </w:rPr>
               <w:tab/>
               <w:t>1</w:t>
             </w:r>
@@ -388,7 +332,7 @@
             <w:bidi w:val="0"/>
             <w:rPr/>
           </w:pPr>
-          <w:hyperlink w:anchor="_Toc1736698902">
+          <w:hyperlink w:anchor="_Toc604252527">
             <w:r>
               <w:rPr>
                 <w:webHidden/>
@@ -399,7 +343,7 @@
               <w:rPr>
                 <w:webHidden/>
               </w:rPr>
-              <w:instrText xml:space="preserve">PAGEREF _Toc1736698902 \h</w:instrText>
+              <w:instrText xml:space="preserve">PAGEREF _Toc604252527 \h</w:instrText>
             </w:r>
             <w:r>
               <w:rPr>
@@ -410,7 +354,6 @@
             <w:r>
               <w:rPr>
                 <w:rStyle w:val="IndexLink"/>
-                <w:vanish w:val="false"/>
                 <w:webHidden/>
               </w:rPr>
               <w:t>Week 1: Introduction to mobile development.</w:t>
@@ -435,7 +378,7 @@
             <w:bidi w:val="0"/>
             <w:rPr/>
           </w:pPr>
-          <w:hyperlink w:anchor="_Toc1270034585">
+          <w:hyperlink w:anchor="_Toc493133488">
             <w:r>
               <w:rPr>
                 <w:webHidden/>
@@ -446,7 +389,7 @@
               <w:rPr>
                 <w:webHidden/>
               </w:rPr>
-              <w:instrText xml:space="preserve">PAGEREF _Toc1270034585 \h</w:instrText>
+              <w:instrText xml:space="preserve">PAGEREF _Toc493133488 \h</w:instrText>
             </w:r>
             <w:r>
               <w:rPr>
@@ -457,7 +400,6 @@
             <w:r>
               <w:rPr>
                 <w:rStyle w:val="IndexLink"/>
-                <w:vanish w:val="false"/>
                 <w:webHidden/>
               </w:rPr>
               <w:t>1.1 Tools/software used</w:t>
@@ -482,7 +424,7 @@
             <w:bidi w:val="0"/>
             <w:rPr/>
           </w:pPr>
-          <w:hyperlink w:anchor="_Toc301155061">
+          <w:hyperlink w:anchor="_Toc463553003">
             <w:r>
               <w:rPr>
                 <w:webHidden/>
@@ -493,7 +435,7 @@
               <w:rPr>
                 <w:webHidden/>
               </w:rPr>
-              <w:instrText xml:space="preserve">PAGEREF _Toc301155061 \h</w:instrText>
+              <w:instrText xml:space="preserve">PAGEREF _Toc463553003 \h</w:instrText>
             </w:r>
             <w:r>
               <w:rPr>
@@ -504,7 +446,6 @@
             <w:r>
               <w:rPr>
                 <w:rStyle w:val="IndexLink"/>
-                <w:vanish w:val="false"/>
                 <w:webHidden/>
               </w:rPr>
               <w:t>1.2 Personal reflection</w:t>
@@ -529,7 +470,7 @@
             <w:bidi w:val="0"/>
             <w:rPr/>
           </w:pPr>
-          <w:hyperlink w:anchor="_Toc14382365">
+          <w:hyperlink w:anchor="_Toc1970378301">
             <w:r>
               <w:rPr>
                 <w:webHidden/>
@@ -540,7 +481,7 @@
               <w:rPr>
                 <w:webHidden/>
               </w:rPr>
-              <w:instrText xml:space="preserve">PAGEREF _Toc14382365 \h</w:instrText>
+              <w:instrText xml:space="preserve">PAGEREF _Toc1970378301 \h</w:instrText>
             </w:r>
             <w:r>
               <w:rPr>
@@ -551,7 +492,6 @@
             <w:r>
               <w:rPr>
                 <w:rStyle w:val="IndexLink"/>
-                <w:vanish w:val="false"/>
                 <w:webHidden/>
               </w:rPr>
               <w:t>Week 2: Mobile Development Environment.</w:t>
@@ -576,7 +516,7 @@
             <w:bidi w:val="0"/>
             <w:rPr/>
           </w:pPr>
-          <w:hyperlink w:anchor="_Toc969530902">
+          <w:hyperlink w:anchor="_Toc517370132">
             <w:r>
               <w:rPr>
                 <w:webHidden/>
@@ -587,7 +527,7 @@
               <w:rPr>
                 <w:webHidden/>
               </w:rPr>
-              <w:instrText xml:space="preserve">PAGEREF _Toc969530902 \h</w:instrText>
+              <w:instrText xml:space="preserve">PAGEREF _Toc517370132 \h</w:instrText>
             </w:r>
             <w:r>
               <w:rPr>
@@ -598,10 +538,55 @@
             <w:r>
               <w:rPr>
                 <w:rStyle w:val="IndexLink"/>
-                <w:vanish w:val="false"/>
-                <w:webHidden/>
-              </w:rPr>
-              <w:t>2.1 Tools/software used</w:t>
+                <w:webHidden/>
+              </w:rPr>
+              <w:t>2.1 Personal reflection</w:t>
+              <w:tab/>
+              <w:t>4</w:t>
+            </w:r>
+            <w:r>
+              <w:rPr>
+                <w:webHidden/>
+              </w:rPr>
+              <w:fldChar w:fldCharType="end"/>
+            </w:r>
+          </w:hyperlink>
+        </w:p>
+        <w:p>
+          <w:pPr>
+            <w:pStyle w:val="TOC1"/>
+            <w:tabs>
+              <w:tab w:val="clear" w:pos="720"/>
+              <w:tab w:val="right" w:pos="9360" w:leader="dot"/>
+            </w:tabs>
+            <w:bidi w:val="0"/>
+            <w:rPr/>
+          </w:pPr>
+          <w:hyperlink w:anchor="_Toc1715661487">
+            <w:r>
+              <w:rPr>
+                <w:webHidden/>
+              </w:rPr>
+              <w:fldChar w:fldCharType="begin"/>
+            </w:r>
+            <w:r>
+              <w:rPr>
+                <w:webHidden/>
+              </w:rPr>
+              <w:instrText xml:space="preserve">PAGEREF _Toc1715661487 \h</w:instrText>
+            </w:r>
+            <w:r>
+              <w:rPr>
+                <w:webHidden/>
+              </w:rPr>
+              <w:fldChar w:fldCharType="separate"/>
+            </w:r>
+            <w:r>
+              <w:rPr>
+                <w:rStyle w:val="IndexLink"/>
+                <w:webHidden/>
+              </w:rPr>
+              <w:t>Week 3: User Interface Design</w:t>
               <w:tab/>
               <w:t>5</w:t>
             </w:r>
@@ -623,7 +608,7 @@
             <w:bidi w:val="0"/>
             <w:rPr/>
           </w:pPr>
-          <w:hyperlink w:anchor="_Toc142354610">
+          <w:hyperlink w:anchor="_Toc1688059430">
             <w:r>
               <w:rPr>
                 <w:webHidden/>
@@ -634,7 +619,7 @@
               <w:rPr>
                 <w:webHidden/>
               </w:rPr>
-              <w:instrText xml:space="preserve">PAGEREF _Toc142354610 \h</w:instrText>
+              <w:instrText xml:space="preserve">PAGEREF _Toc1688059430 \h</w:instrText>
             </w:r>
             <w:r>
               <w:rPr>
@@ -645,12 +630,11 @@
             <w:r>
               <w:rPr>
                 <w:rStyle w:val="IndexLink"/>
-                <w:vanish w:val="false"/>
-                <w:webHidden/>
-              </w:rPr>
-              <w:t>2.2 Personal reflection</w:t>
+                <w:webHidden/>
+              </w:rPr>
+              <w:t>3.1 Personal reflection</w:t>
               <w:tab/>
-              <w:t>5</w:t>
+              <w:t>7</w:t>
             </w:r>
             <w:r>
               <w:rPr>
@@ -670,7 +654,7 @@
             <w:bidi w:val="0"/>
             <w:rPr/>
           </w:pPr>
-          <w:hyperlink w:anchor="_Toc1078878768">
+          <w:hyperlink w:anchor="_Toc511899285">
             <w:r>
               <w:rPr>
                 <w:webHidden/>
@@ -681,7 +665,7 @@
               <w:rPr>
                 <w:webHidden/>
               </w:rPr>
-              <w:instrText xml:space="preserve">PAGEREF _Toc1078878768 \h</w:instrText>
+              <w:instrText xml:space="preserve">PAGEREF _Toc511899285 \h</w:instrText>
             </w:r>
             <w:r>
               <w:rPr>
@@ -692,12 +676,11 @@
             <w:r>
               <w:rPr>
                 <w:rStyle w:val="IndexLink"/>
-                <w:vanish w:val="false"/>
-                <w:webHidden/>
-              </w:rPr>
-              <w:t>Week 3: User Interface Design</w:t>
+                <w:webHidden/>
+              </w:rPr>
+              <w:t>Week 4 : event handling and user interaction</w:t>
               <w:tab/>
-              <w:t>5</w:t>
+              <w:t>8</w:t>
             </w:r>
             <w:r>
               <w:rPr>
@@ -717,7 +700,7 @@
             <w:bidi w:val="0"/>
             <w:rPr/>
           </w:pPr>
-          <w:hyperlink w:anchor="_Toc285706414">
+          <w:hyperlink w:anchor="_Toc611807717">
             <w:r>
               <w:rPr>
                 <w:webHidden/>
@@ -728,7 +711,7 @@
               <w:rPr>
                 <w:webHidden/>
               </w:rPr>
-              <w:instrText xml:space="preserve">PAGEREF _Toc285706414 \h</w:instrText>
+              <w:instrText xml:space="preserve">PAGEREF _Toc611807717 \h</w:instrText>
             </w:r>
             <w:r>
               <w:rPr>
@@ -739,12 +722,57 @@
             <w:r>
               <w:rPr>
                 <w:rStyle w:val="IndexLink"/>
-                <w:vanish w:val="false"/>
-                <w:webHidden/>
-              </w:rPr>
-              <w:t>3.1 Tools/ Software used</w:t>
+                <w:webHidden/>
+              </w:rPr>
+              <w:t>4.1 Personal reflection</w:t>
               <w:tab/>
-              <w:t>8</w:t>
+              <w:t>11</w:t>
+            </w:r>
+            <w:r>
+              <w:rPr>
+                <w:webHidden/>
+              </w:rPr>
+              <w:fldChar w:fldCharType="end"/>
+            </w:r>
+          </w:hyperlink>
+        </w:p>
+        <w:p>
+          <w:pPr>
+            <w:pStyle w:val="TOC1"/>
+            <w:tabs>
+              <w:tab w:val="clear" w:pos="720"/>
+              <w:tab w:val="right" w:pos="9360" w:leader="dot"/>
+            </w:tabs>
+            <w:bidi w:val="0"/>
+            <w:rPr/>
+          </w:pPr>
+          <w:hyperlink w:anchor="_Toc132451714">
+            <w:r>
+              <w:rPr>
+                <w:webHidden/>
+              </w:rPr>
+              <w:fldChar w:fldCharType="begin"/>
+            </w:r>
+            <w:r>
+              <w:rPr>
+                <w:webHidden/>
+              </w:rPr>
+              <w:instrText xml:space="preserve">PAGEREF _Toc132451714 \h</w:instrText>
+            </w:r>
+            <w:r>
+              <w:rPr>
+                <w:webHidden/>
+              </w:rPr>
+              <w:fldChar w:fldCharType="separate"/>
+            </w:r>
+            <w:r>
+              <w:rPr>
+                <w:rStyle w:val="IndexLink"/>
+                <w:webHidden/>
+              </w:rPr>
+              <w:t>Week 5: Data Management</w:t>
+              <w:tab/>
+              <w:t>11</w:t>
             </w:r>
             <w:r>
               <w:rPr>
@@ -764,7 +792,7 @@
             <w:bidi w:val="0"/>
             <w:rPr/>
           </w:pPr>
-          <w:hyperlink w:anchor="_Toc1227389364">
+          <w:hyperlink w:anchor="_Toc1860295451">
             <w:r>
               <w:rPr>
                 <w:webHidden/>
@@ -775,7 +803,7 @@
               <w:rPr>
                 <w:webHidden/>
               </w:rPr>
-              <w:instrText xml:space="preserve">PAGEREF _Toc1227389364 \h</w:instrText>
+              <w:instrText xml:space="preserve">PAGEREF _Toc1860295451 \h</w:instrText>
             </w:r>
             <w:r>
               <w:rPr>
@@ -786,12 +814,11 @@
             <w:r>
               <w:rPr>
                 <w:rStyle w:val="IndexLink"/>
-                <w:vanish w:val="false"/>
-                <w:webHidden/>
-              </w:rPr>
-              <w:t>3.2 Personal reflection</w:t>
+                <w:webHidden/>
+              </w:rPr>
+              <w:t>5.1 Personal Reflection</w:t>
               <w:tab/>
-              <w:t>9</w:t>
+              <w:t>13</w:t>
             </w:r>
             <w:r>
               <w:rPr>
@@ -803,7 +830,6 @@
           <w:r>
             <w:rPr>
               <w:rStyle w:val="IndexLink"/>
-              <w:vanish w:val="false"/>
             </w:rPr>
             <w:fldChar w:fldCharType="end"/>
           </w:r>
@@ -863,7 +889,7 @@
           <w:lang w:val="en-US"/>
         </w:rPr>
       </w:pPr>
-      <w:bookmarkStart w:id="1" w:name="_Toc1736698902"/>
+      <w:bookmarkStart w:id="1" w:name="_Toc604252527"/>
       <w:r>
         <w:rPr>
           <w:u w:val="single"/>
@@ -1029,7 +1055,7 @@
         <w:pStyle w:val="Heading2"/>
         <w:rPr/>
       </w:pPr>
-      <w:bookmarkStart w:id="2" w:name="_Toc1270034585"/>
+      <w:bookmarkStart w:id="2" w:name="_Toc493133488"/>
       <w:r>
         <w:rPr/>
         <w:t>1.1 Tools/software used</w:t>
@@ -1090,7 +1116,7 @@
         <w:pStyle w:val="Heading2"/>
         <w:rPr/>
       </w:pPr>
-      <w:bookmarkStart w:id="3" w:name="_Toc301155061"/>
+      <w:bookmarkStart w:id="3" w:name="_Toc463553003"/>
       <w:r>
         <w:rPr/>
         <w:t>1.2 Personal reflection</w:t>
@@ -1111,7 +1137,7 @@
       </w:pPr>
       <w:r>
         <w:rPr>
-          <w:rFonts w:eastAsia="Aptos" w:cs="Aptos"/>
+          <w:rFonts w:eastAsia="Aptos" w:cs="Aptos" w:ascii="Aptos" w:hAnsi="Aptos"/>
           <w:b w:val="false"/>
           <w:bCs w:val="false"/>
           <w:sz w:val="24"/>
@@ -1135,7 +1161,7 @@
       </w:pPr>
       <w:r>
         <w:rPr>
-          <w:rFonts w:eastAsia="Aptos" w:cs="Aptos"/>
+          <w:rFonts w:eastAsia="Aptos" w:cs="Aptos" w:ascii="Aptos" w:hAnsi="Aptos"/>
           <w:b w:val="false"/>
           <w:bCs w:val="false"/>
           <w:sz w:val="24"/>
@@ -1158,7 +1184,7 @@
       </w:pPr>
       <w:r>
         <w:rPr>
-          <w:rFonts w:eastAsia="Aptos" w:cs="Aptos"/>
+          <w:rFonts w:eastAsia="Aptos" w:cs="Aptos" w:ascii="Aptos" w:hAnsi="Aptos"/>
           <w:b w:val="false"/>
           <w:bCs w:val="false"/>
           <w:sz w:val="24"/>
@@ -1181,7 +1207,7 @@
       </w:pPr>
       <w:r>
         <w:rPr>
-          <w:rFonts w:eastAsia="Aptos" w:cs="Aptos"/>
+          <w:rFonts w:eastAsia="Aptos" w:cs="Aptos" w:ascii="Aptos" w:hAnsi="Aptos"/>
           <w:b w:val="false"/>
           <w:bCs w:val="false"/>
           <w:sz w:val="24"/>
@@ -1279,7 +1305,7 @@
         <w:pStyle w:val="Heading1"/>
         <w:rPr/>
       </w:pPr>
-      <w:bookmarkStart w:id="4" w:name="_Toc14382365"/>
+      <w:bookmarkStart w:id="4" w:name="_Toc1970378301"/>
       <w:r>
         <w:rPr>
           <w:u w:val="single"/>
@@ -1417,25 +1443,66 @@
     </w:p>
     <w:p>
       <w:pPr>
-        <w:pStyle w:val="Normal"/>
-        <w:rPr/>
-      </w:pPr>
-      <w:r>
-        <w:rPr/>
-      </w:r>
-    </w:p>
-    <w:p>
-      <w:pPr>
-        <w:pStyle w:val="Normal"/>
-        <w:rPr>
-          <w:rStyle w:val="FootnoteCharacters"/>
-        </w:rPr>
+        <w:pStyle w:val="Heading2"/>
+        <w:rPr/>
+      </w:pPr>
+      <w:bookmarkStart w:id="5" w:name="_Toc517370132"/>
+      <w:r>
+        <w:rPr/>
+        <w:t>2.1 Personal reflection</w:t>
+      </w:r>
+      <w:bookmarkEnd w:id="5"/>
+    </w:p>
+    <w:p>
+      <w:pPr>
+        <w:pStyle w:val="Normal"/>
+        <w:rPr/>
+      </w:pPr>
+      <w:r>
+        <w:rPr>
+          <w:rFonts w:eastAsia="Aptos" w:cs="Aptos" w:ascii="Aptos" w:hAnsi="Aptos"/>
+          <w:sz w:val="24"/>
+          <w:szCs w:val="24"/>
+          <w:lang w:val="en-US"/>
+        </w:rPr>
+        <w:t>This week I successfully connected my mobile device to the Expo development server and ran my first React Native application. Seeing code changes reflected instantly on my phone helped me understand the mobile development workflow and improved my confidence in using Expo and React Native.</w:t>
+      </w:r>
+    </w:p>
+    <w:p>
+      <w:pPr>
+        <w:pStyle w:val="Normal"/>
+        <w:rPr/>
+      </w:pPr>
+      <w:r>
+        <w:rPr/>
+      </w:r>
+    </w:p>
+    <w:p>
+      <w:pPr>
+        <w:pStyle w:val="Heading1"/>
+        <w:rPr>
+          <w:u w:val="single"/>
+        </w:rPr>
+      </w:pPr>
+      <w:bookmarkStart w:id="6" w:name="_Toc1715661487"/>
+      <w:r>
+        <w:rPr>
+          <w:u w:val="single"/>
+        </w:rPr>
+        <w:t>Week 3: User Interface Design</w:t>
+      </w:r>
+      <w:bookmarkEnd w:id="6"/>
+    </w:p>
+    <w:p>
+      <w:pPr>
+        <w:pStyle w:val="Normal"/>
+        <w:rPr/>
       </w:pPr>
       <w:r>
         <w:rPr/>
         <w:drawing>
           <wp:inline distT="0" distB="0" distL="0" distR="0">
-            <wp:extent cx="6248400" cy="2152650"/>
+            <wp:extent cx="3562350" cy="6029325"/>
             <wp:effectExtent l="0" t="0" r="0" b="0"/>
             <wp:docPr id="5" name="Image5"/>
             <wp:cNvGraphicFramePr>
@@ -1459,7 +1526,7 @@
                   <pic:spPr bwMode="auto">
                     <a:xfrm>
                       <a:off x="0" y="0"/>
-                      <a:ext cx="6248400" cy="2152650"/>
+                      <a:ext cx="3562350" cy="6029325"/>
                     </a:xfrm>
                     <a:prstGeom prst="rect">
                       <a:avLst/>
@@ -1472,161 +1539,23 @@
           </wp:inline>
         </w:drawing>
       </w:r>
-      <w:r>
-        <w:rPr>
-          <w:rStyle w:val="FootnoteCharacters"/>
-        </w:rPr>
-        <w:t xml:space="preserve"> </w:t>
-      </w:r>
-      <w:r>
-        <w:rPr>
-          <w:rStyle w:val="FootnoteCharacters"/>
-        </w:rPr>
-        <w:t>Fig.2.2: Code snippet.</w:t>
-      </w:r>
-    </w:p>
-    <w:p>
-      <w:pPr>
-        <w:pStyle w:val="Heading2"/>
-        <w:rPr>
-          <w:rStyle w:val="FootnoteCharacters"/>
-        </w:rPr>
-      </w:pPr>
-      <w:bookmarkStart w:id="5" w:name="_Toc969530902"/>
-      <w:r>
-        <w:rPr/>
-        <w:t>2.1 Tools/software used</w:t>
-      </w:r>
-      <w:bookmarkEnd w:id="5"/>
-    </w:p>
-    <w:p>
-      <w:pPr>
-        <w:pStyle w:val="Normal"/>
-        <w:rPr/>
-      </w:pPr>
-      <w:r>
-        <w:rPr/>
-        <w:t>1.vs code</w:t>
-      </w:r>
-    </w:p>
-    <w:p>
-      <w:pPr>
-        <w:pStyle w:val="Normal"/>
-        <w:rPr/>
-      </w:pPr>
-      <w:r>
-        <w:rPr/>
-        <w:t>2.node.js</w:t>
-      </w:r>
-    </w:p>
-    <w:p>
-      <w:pPr>
-        <w:pStyle w:val="Normal"/>
-        <w:rPr/>
-      </w:pPr>
-      <w:r>
-        <w:rPr/>
-        <w:t>3.npm</w:t>
-      </w:r>
-    </w:p>
-    <w:p>
-      <w:pPr>
-        <w:pStyle w:val="Normal"/>
-        <w:rPr/>
-      </w:pPr>
-      <w:r>
-        <w:rPr/>
-        <w:t>4.Expo</w:t>
-      </w:r>
-    </w:p>
-    <w:p>
-      <w:pPr>
-        <w:pStyle w:val="Normal"/>
-        <w:rPr/>
-      </w:pPr>
-      <w:r>
-        <w:rPr/>
-        <w:t>5.Expo Go</w:t>
-      </w:r>
-    </w:p>
-    <w:p>
-      <w:pPr>
-        <w:pStyle w:val="Normal"/>
-        <w:rPr/>
-      </w:pPr>
-      <w:r>
-        <w:rPr/>
-        <w:t>6.Android Smartphone</w:t>
-      </w:r>
-    </w:p>
-    <w:p>
-      <w:pPr>
-        <w:pStyle w:val="Normal"/>
-        <w:rPr/>
-      </w:pPr>
-      <w:r>
-        <w:rPr/>
-      </w:r>
-    </w:p>
-    <w:p>
-      <w:pPr>
-        <w:pStyle w:val="Heading2"/>
-        <w:rPr/>
-      </w:pPr>
-      <w:bookmarkStart w:id="6" w:name="_Toc142354610"/>
-      <w:r>
-        <w:rPr/>
-        <w:t>2.2 Personal reflection</w:t>
-      </w:r>
-      <w:bookmarkEnd w:id="6"/>
-    </w:p>
-    <w:p>
-      <w:pPr>
-        <w:pStyle w:val="Normal"/>
-        <w:rPr/>
-      </w:pPr>
-      <w:r>
-        <w:rPr>
-          <w:rFonts w:eastAsia="Aptos" w:cs="Aptos"/>
+    </w:p>
+    <w:p>
+      <w:pPr>
+        <w:pStyle w:val="Normal"/>
+        <w:rPr>
+          <w:rFonts w:ascii="Aptos" w:hAnsi="Aptos" w:eastAsia="Aptos" w:cs="Aptos"/>
+          <w:color w:val="1A237E"/>
           <w:sz w:val="24"/>
           <w:szCs w:val="24"/>
           <w:lang w:val="en-US"/>
         </w:rPr>
-        <w:t>This week I successfully connected my mobile device to the Expo development server and ran my first React Native application. Seeing code changes reflected instantly on my phone helped me understand the mobile development workflow and improved my confidence in using Expo and React Native.</w:t>
-      </w:r>
-    </w:p>
-    <w:p>
-      <w:pPr>
-        <w:pStyle w:val="Normal"/>
-        <w:rPr/>
-      </w:pPr>
-      <w:r>
-        <w:rPr/>
-      </w:r>
-    </w:p>
-    <w:p>
-      <w:pPr>
-        <w:pStyle w:val="Heading1"/>
-        <w:rPr>
-          <w:u w:val="single"/>
-        </w:rPr>
-      </w:pPr>
-      <w:bookmarkStart w:id="7" w:name="_Toc1078878768"/>
-      <w:r>
-        <w:rPr>
-          <w:u w:val="single"/>
-        </w:rPr>
-        <w:t>Week 3: User Interface Design</w:t>
-      </w:r>
-      <w:bookmarkEnd w:id="7"/>
-    </w:p>
-    <w:p>
-      <w:pPr>
-        <w:pStyle w:val="Normal"/>
-        <w:rPr/>
-      </w:pPr>
-      <w:r>
-        <w:rPr/>
+      </w:pPr>
+      <w:r>
+        <w:rPr>
+          <w:rStyle w:val="FootnoteCharacters"/>
+        </w:rPr>
+        <w:t>Fig 3.0: MileWise welcome Screen Wireframe - Figma</w:t>
       </w:r>
     </w:p>
     <w:p>
@@ -1638,7 +1567,7 @@
         <w:rPr/>
         <w:drawing>
           <wp:inline distT="0" distB="0" distL="0" distR="0">
-            <wp:extent cx="3562350" cy="6029325"/>
+            <wp:extent cx="2276475" cy="3495675"/>
             <wp:effectExtent l="0" t="0" r="0" b="0"/>
             <wp:docPr id="6" name="Image6"/>
             <wp:cNvGraphicFramePr>
@@ -1662,7 +1591,7 @@
                   <pic:spPr bwMode="auto">
                     <a:xfrm>
                       <a:off x="0" y="0"/>
-                      <a:ext cx="3562350" cy="6029325"/>
+                      <a:ext cx="2276475" cy="3495675"/>
                     </a:xfrm>
                     <a:prstGeom prst="rect">
                       <a:avLst/>
@@ -1691,7 +1620,7 @@
         <w:rPr>
           <w:rStyle w:val="FootnoteCharacters"/>
         </w:rPr>
-        <w:t>Fig 3.0: MileWise welcome Screen Wireframe - Figma</w:t>
+        <w:t>Fig 3.1: MileWise vehicle Profile Screen Wireframe - Figma</w:t>
       </w:r>
     </w:p>
     <w:p>
@@ -1703,7 +1632,7 @@
         <w:rPr/>
         <w:drawing>
           <wp:inline distT="0" distB="0" distL="0" distR="0">
-            <wp:extent cx="2276475" cy="3495675"/>
+            <wp:extent cx="2152650" cy="3629025"/>
             <wp:effectExtent l="0" t="0" r="0" b="0"/>
             <wp:docPr id="7" name="Image7"/>
             <wp:cNvGraphicFramePr>
@@ -1727,7 +1656,7 @@
                   <pic:spPr bwMode="auto">
                     <a:xfrm>
                       <a:off x="0" y="0"/>
-                      <a:ext cx="2276475" cy="3495675"/>
+                      <a:ext cx="2152650" cy="3629025"/>
                     </a:xfrm>
                     <a:prstGeom prst="rect">
                       <a:avLst/>
@@ -1756,7 +1685,18 @@
         <w:rPr>
           <w:rStyle w:val="FootnoteCharacters"/>
         </w:rPr>
-        <w:t>Fig 3.1: MileWise vehicle Profile Screen Wireframe - Figma</w:t>
+        <w:t>Fig 3.2: MileWise Dashboard Screen Wireframe - Figma</w:t>
+      </w:r>
+    </w:p>
+    <w:p>
+      <w:pPr>
+        <w:pStyle w:val="Normal"/>
+        <w:rPr>
+          <w:rStyle w:val="FootnoteCharacters"/>
+        </w:rPr>
+      </w:pPr>
+      <w:r>
+        <w:rPr/>
       </w:r>
     </w:p>
     <w:p>
@@ -1768,7 +1708,7 @@
         <w:rPr/>
         <w:drawing>
           <wp:inline distT="0" distB="0" distL="0" distR="0">
-            <wp:extent cx="2152650" cy="3629025"/>
+            <wp:extent cx="2152650" cy="3248025"/>
             <wp:effectExtent l="0" t="0" r="0" b="0"/>
             <wp:docPr id="8" name="Image8"/>
             <wp:cNvGraphicFramePr>
@@ -1792,7 +1732,7 @@
                   <pic:spPr bwMode="auto">
                     <a:xfrm>
                       <a:off x="0" y="0"/>
-                      <a:ext cx="2152650" cy="3629025"/>
+                      <a:ext cx="2152650" cy="3248025"/>
                     </a:xfrm>
                     <a:prstGeom prst="rect">
                       <a:avLst/>
@@ -1821,30 +1761,25 @@
         <w:rPr>
           <w:rStyle w:val="FootnoteCharacters"/>
         </w:rPr>
-        <w:t>Fig 3.2: MileWise Dashboard Screen Wireframe - Figma</w:t>
-      </w:r>
-    </w:p>
-    <w:p>
-      <w:pPr>
-        <w:pStyle w:val="Normal"/>
-        <w:rPr>
-          <w:rStyle w:val="FootnoteCharacters"/>
-        </w:rPr>
-      </w:pPr>
-      <w:r>
-        <w:rPr/>
-      </w:r>
-    </w:p>
-    <w:p>
-      <w:pPr>
-        <w:pStyle w:val="Normal"/>
-        <w:rPr/>
+        <w:t>Fig 3.3: MileWise Maintenance Tracker Screen Wireframe – Figma</w:t>
+      </w:r>
+    </w:p>
+    <w:p>
+      <w:pPr>
+        <w:pStyle w:val="Normal"/>
+        <w:rPr>
+          <w:rFonts w:ascii="Aptos" w:hAnsi="Aptos" w:eastAsia="Aptos" w:cs="Aptos"/>
+          <w:color w:val="1A237E"/>
+          <w:sz w:val="24"/>
+          <w:szCs w:val="24"/>
+          <w:lang w:val="en-US"/>
+        </w:rPr>
       </w:pPr>
       <w:r>
         <w:rPr/>
         <w:drawing>
           <wp:inline distT="0" distB="0" distL="0" distR="0">
-            <wp:extent cx="2152650" cy="3248025"/>
+            <wp:extent cx="2152650" cy="3514725"/>
             <wp:effectExtent l="0" t="0" r="0" b="0"/>
             <wp:docPr id="9" name="Image9"/>
             <wp:cNvGraphicFramePr>
@@ -1868,7 +1803,7 @@
                   <pic:spPr bwMode="auto">
                     <a:xfrm>
                       <a:off x="0" y="0"/>
-                      <a:ext cx="2152650" cy="3248025"/>
+                      <a:ext cx="2152650" cy="3514725"/>
                     </a:xfrm>
                     <a:prstGeom prst="rect">
                       <a:avLst/>
@@ -1897,25 +1832,109 @@
         <w:rPr>
           <w:rStyle w:val="FootnoteCharacters"/>
         </w:rPr>
-        <w:t>Fig 3.3: MileWise Maintenance Tracker Screen Wireframe – Figma</w:t>
-      </w:r>
-    </w:p>
-    <w:p>
-      <w:pPr>
-        <w:pStyle w:val="Normal"/>
-        <w:rPr>
-          <w:rFonts w:ascii="Aptos" w:hAnsi="Aptos" w:eastAsia="Aptos" w:cs="Aptos"/>
-          <w:color w:val="1A237E"/>
+        <w:t>Fig 3.4: MileWise Reminders Screen Wireframe – Figma</w:t>
+      </w:r>
+    </w:p>
+    <w:p>
+      <w:pPr>
+        <w:pStyle w:val="Normal"/>
+        <w:rPr/>
+      </w:pPr>
+      <w:r>
+        <w:rPr/>
+      </w:r>
+    </w:p>
+    <w:p>
+      <w:pPr>
+        <w:pStyle w:val="Heading2"/>
+        <w:rPr/>
+      </w:pPr>
+      <w:bookmarkStart w:id="7" w:name="_Toc1688059430"/>
+      <w:r>
+        <w:rPr/>
+        <w:t>3.1 Personal reflection</w:t>
+      </w:r>
+      <w:bookmarkEnd w:id="7"/>
+    </w:p>
+    <w:p>
+      <w:pPr>
+        <w:pStyle w:val="Normal"/>
+        <w:rPr/>
+      </w:pPr>
+      <w:r>
+        <w:rPr>
+          <w:rFonts w:eastAsia="Aptos" w:cs="Aptos" w:ascii="Aptos" w:hAnsi="Aptos"/>
           <w:sz w:val="24"/>
           <w:szCs w:val="24"/>
           <w:lang w:val="en-US"/>
         </w:rPr>
+        <w:t>This week I learned the importance of planning the user interface before development. Creating wireframes in Figma helped me visualize the application structure, improve navigation flow, and identify design improvements before writing code.</w:t>
+      </w:r>
+    </w:p>
+    <w:p>
+      <w:pPr>
+        <w:pStyle w:val="Normal"/>
+        <w:rPr>
+          <w:rFonts w:ascii="Aptos" w:hAnsi="Aptos" w:eastAsia="Aptos" w:cs="Aptos"/>
+          <w:sz w:val="24"/>
+          <w:szCs w:val="24"/>
+          <w:lang w:val="en-US"/>
+        </w:rPr>
+      </w:pPr>
+      <w:r>
+        <w:rPr>
+          <w:rFonts w:eastAsia="Aptos" w:cs="Aptos" w:ascii="Aptos" w:hAnsi="Aptos"/>
+          <w:sz w:val="24"/>
+          <w:szCs w:val="24"/>
+          <w:lang w:val="en-US"/>
+        </w:rPr>
+      </w:r>
+    </w:p>
+    <w:p>
+      <w:pPr>
+        <w:pStyle w:val="Normal"/>
+        <w:rPr>
+          <w:rFonts w:ascii="Aptos" w:hAnsi="Aptos" w:eastAsia="Aptos" w:cs="Aptos"/>
+          <w:sz w:val="24"/>
+          <w:szCs w:val="24"/>
+          <w:lang w:val="en-US"/>
+        </w:rPr>
+      </w:pPr>
+      <w:r>
+        <w:rPr>
+          <w:rFonts w:eastAsia="Aptos" w:cs="Aptos" w:ascii="Aptos" w:hAnsi="Aptos"/>
+          <w:sz w:val="24"/>
+          <w:szCs w:val="24"/>
+          <w:lang w:val="en-US"/>
+        </w:rPr>
+      </w:r>
+    </w:p>
+    <w:p>
+      <w:pPr>
+        <w:pStyle w:val="Heading1"/>
+        <w:rPr>
+          <w:lang w:val="en-US"/>
+        </w:rPr>
+      </w:pPr>
+      <w:bookmarkStart w:id="8" w:name="_Toc511899285"/>
+      <w:r>
+        <w:rPr>
+          <w:lang w:val="en-US"/>
+        </w:rPr>
+        <w:t>Week 4 : event handling and user interaction</w:t>
+      </w:r>
+      <w:bookmarkEnd w:id="8"/>
+    </w:p>
+    <w:p>
+      <w:pPr>
+        <w:pStyle w:val="Normal"/>
+        <w:rPr/>
       </w:pPr>
       <w:r>
         <w:rPr/>
         <w:drawing>
           <wp:inline distT="0" distB="0" distL="0" distR="0">
-            <wp:extent cx="2152650" cy="3514725"/>
+            <wp:extent cx="2657475" cy="4470400"/>
             <wp:effectExtent l="0" t="0" r="0" b="0"/>
             <wp:docPr id="10" name="Image10"/>
             <wp:cNvGraphicFramePr>
@@ -1939,7 +1958,7 @@
                   <pic:spPr bwMode="auto">
                     <a:xfrm>
                       <a:off x="0" y="0"/>
-                      <a:ext cx="2152650" cy="3514725"/>
+                      <a:ext cx="2657475" cy="4470400"/>
                     </a:xfrm>
                     <a:prstGeom prst="rect">
                       <a:avLst/>
@@ -1957,18 +1976,287 @@
       <w:pPr>
         <w:pStyle w:val="Normal"/>
         <w:rPr>
-          <w:rFonts w:ascii="Aptos" w:hAnsi="Aptos" w:eastAsia="Aptos" w:cs="Aptos"/>
-          <w:color w:val="1A237E"/>
-          <w:sz w:val="24"/>
-          <w:szCs w:val="24"/>
-          <w:lang w:val="en-US"/>
-        </w:rPr>
-      </w:pPr>
-      <w:r>
-        <w:rPr>
-          <w:rStyle w:val="FootnoteCharacters"/>
-        </w:rPr>
-        <w:t>Fig 3.4: MileWise Reminders Screen Wireframe – Figma</w:t>
+          <w:b/>
+          <w:bCs/>
+          <w:sz w:val="18"/>
+          <w:szCs w:val="18"/>
+        </w:rPr>
+      </w:pPr>
+      <w:r>
+        <w:rPr>
+          <w:b/>
+          <w:bCs/>
+          <w:sz w:val="18"/>
+          <w:szCs w:val="18"/>
+        </w:rPr>
+        <w:t>Fig 4.0 welcome page</w:t>
+      </w:r>
+    </w:p>
+    <w:p>
+      <w:pPr>
+        <w:pStyle w:val="Normal"/>
+        <w:rPr>
+          <w:b/>
+          <w:bCs/>
+          <w:sz w:val="18"/>
+          <w:szCs w:val="18"/>
+        </w:rPr>
+      </w:pPr>
+      <w:r>
+        <w:rPr>
+          <w:b/>
+          <w:bCs/>
+          <w:sz w:val="18"/>
+          <w:szCs w:val="18"/>
+        </w:rPr>
+      </w:r>
+    </w:p>
+    <w:p>
+      <w:pPr>
+        <w:pStyle w:val="Normal"/>
+        <w:rPr>
+          <w:b/>
+          <w:bCs/>
+          <w:sz w:val="18"/>
+          <w:szCs w:val="18"/>
+        </w:rPr>
+      </w:pPr>
+      <w:r>
+        <w:rPr>
+          <w:b/>
+          <w:bCs/>
+          <w:sz w:val="18"/>
+          <w:szCs w:val="18"/>
+        </w:rPr>
+      </w:r>
+    </w:p>
+    <w:p>
+      <w:pPr>
+        <w:pStyle w:val="Normal"/>
+        <w:rPr/>
+      </w:pPr>
+      <w:r>
+        <w:rPr/>
+        <w:drawing>
+          <wp:inline distT="0" distB="0" distL="0" distR="0">
+            <wp:extent cx="2657475" cy="5943600"/>
+            <wp:effectExtent l="0" t="0" r="0" b="0"/>
+            <wp:docPr id="11" name="Image11"/>
+            <wp:cNvGraphicFramePr>
+              <a:graphicFrameLocks xmlns:a="http://schemas.openxmlformats.org/drawingml/2006/main" noChangeAspect="1"/>
+            </wp:cNvGraphicFramePr>
+            <a:graphic xmlns:a="http://schemas.openxmlformats.org/drawingml/2006/main">
+              <a:graphicData uri="http://schemas.openxmlformats.org/drawingml/2006/picture">
+                <pic:pic xmlns:pic="http://schemas.openxmlformats.org/drawingml/2006/picture">
+                  <pic:nvPicPr>
+                    <pic:cNvPr id="11" name="Image11"/>
+                    <pic:cNvPicPr>
+                      <a:picLocks noChangeAspect="1" noChangeArrowheads="1"/>
+                    </pic:cNvPicPr>
+                  </pic:nvPicPr>
+                  <pic:blipFill>
+                    <a:blip r:embed="rId12"/>
+                    <a:stretch>
+                      <a:fillRect/>
+                    </a:stretch>
+                  </pic:blipFill>
+                  <pic:spPr bwMode="auto">
+                    <a:xfrm>
+                      <a:off x="0" y="0"/>
+                      <a:ext cx="2657475" cy="5943600"/>
+                    </a:xfrm>
+                    <a:prstGeom prst="rect">
+                      <a:avLst/>
+                    </a:prstGeom>
+                    <a:noFill/>
+                  </pic:spPr>
+                </pic:pic>
+              </a:graphicData>
+            </a:graphic>
+          </wp:inline>
+        </w:drawing>
+      </w:r>
+    </w:p>
+    <w:p>
+      <w:pPr>
+        <w:pStyle w:val="Normal"/>
+        <w:rPr>
+          <w:b/>
+          <w:bCs/>
+          <w:sz w:val="18"/>
+          <w:szCs w:val="18"/>
+        </w:rPr>
+      </w:pPr>
+      <w:r>
+        <w:rPr>
+          <w:b/>
+          <w:bCs/>
+          <w:sz w:val="18"/>
+          <w:szCs w:val="18"/>
+        </w:rPr>
+        <w:t>Fig 4.1 Vehicle registration page</w:t>
+      </w:r>
+    </w:p>
+    <w:p>
+      <w:pPr>
+        <w:pStyle w:val="Normal"/>
+        <w:rPr/>
+      </w:pPr>
+      <w:r>
+        <w:rPr/>
+        <w:drawing>
+          <wp:inline distT="0" distB="0" distL="0" distR="0">
+            <wp:extent cx="2657475" cy="5943600"/>
+            <wp:effectExtent l="0" t="0" r="0" b="0"/>
+            <wp:docPr id="12" name="Image12"/>
+            <wp:cNvGraphicFramePr>
+              <a:graphicFrameLocks xmlns:a="http://schemas.openxmlformats.org/drawingml/2006/main" noChangeAspect="1"/>
+            </wp:cNvGraphicFramePr>
+            <a:graphic xmlns:a="http://schemas.openxmlformats.org/drawingml/2006/main">
+              <a:graphicData uri="http://schemas.openxmlformats.org/drawingml/2006/picture">
+                <pic:pic xmlns:pic="http://schemas.openxmlformats.org/drawingml/2006/picture">
+                  <pic:nvPicPr>
+                    <pic:cNvPr id="12" name="Image12"/>
+                    <pic:cNvPicPr>
+                      <a:picLocks noChangeAspect="1" noChangeArrowheads="1"/>
+                    </pic:cNvPicPr>
+                  </pic:nvPicPr>
+                  <pic:blipFill>
+                    <a:blip r:embed="rId13"/>
+                    <a:stretch>
+                      <a:fillRect/>
+                    </a:stretch>
+                  </pic:blipFill>
+                  <pic:spPr bwMode="auto">
+                    <a:xfrm>
+                      <a:off x="0" y="0"/>
+                      <a:ext cx="2657475" cy="5943600"/>
+                    </a:xfrm>
+                    <a:prstGeom prst="rect">
+                      <a:avLst/>
+                    </a:prstGeom>
+                    <a:noFill/>
+                  </pic:spPr>
+                </pic:pic>
+              </a:graphicData>
+            </a:graphic>
+          </wp:inline>
+        </w:drawing>
+      </w:r>
+    </w:p>
+    <w:p>
+      <w:pPr>
+        <w:pStyle w:val="Normal"/>
+        <w:rPr>
+          <w:b/>
+          <w:bCs/>
+          <w:sz w:val="18"/>
+          <w:szCs w:val="18"/>
+        </w:rPr>
+      </w:pPr>
+      <w:r>
+        <w:rPr>
+          <w:b/>
+          <w:bCs/>
+          <w:sz w:val="18"/>
+          <w:szCs w:val="18"/>
+        </w:rPr>
+        <w:t>Fig 4.2 maintenance tracker page</w:t>
+      </w:r>
+    </w:p>
+    <w:p>
+      <w:pPr>
+        <w:pStyle w:val="Normal"/>
+        <w:rPr>
+          <w:b/>
+          <w:bCs/>
+          <w:sz w:val="18"/>
+          <w:szCs w:val="18"/>
+        </w:rPr>
+      </w:pPr>
+      <w:r>
+        <w:rPr>
+          <w:b/>
+          <w:bCs/>
+          <w:sz w:val="18"/>
+          <w:szCs w:val="18"/>
+        </w:rPr>
+      </w:r>
+    </w:p>
+    <w:p>
+      <w:pPr>
+        <w:pStyle w:val="Normal"/>
+        <w:rPr/>
+      </w:pPr>
+      <w:r>
+        <w:rPr/>
+        <w:drawing>
+          <wp:inline distT="0" distB="0" distL="0" distR="0">
+            <wp:extent cx="2657475" cy="5943600"/>
+            <wp:effectExtent l="0" t="0" r="0" b="0"/>
+            <wp:docPr id="13" name="Image13"/>
+            <wp:cNvGraphicFramePr>
+              <a:graphicFrameLocks xmlns:a="http://schemas.openxmlformats.org/drawingml/2006/main" noChangeAspect="1"/>
+            </wp:cNvGraphicFramePr>
+            <a:graphic xmlns:a="http://schemas.openxmlformats.org/drawingml/2006/main">
+              <a:graphicData uri="http://schemas.openxmlformats.org/drawingml/2006/picture">
+                <pic:pic xmlns:pic="http://schemas.openxmlformats.org/drawingml/2006/picture">
+                  <pic:nvPicPr>
+                    <pic:cNvPr id="13" name="Image13"/>
+                    <pic:cNvPicPr>
+                      <a:picLocks noChangeAspect="1" noChangeArrowheads="1"/>
+                    </pic:cNvPicPr>
+                  </pic:nvPicPr>
+                  <pic:blipFill>
+                    <a:blip r:embed="rId14"/>
+                    <a:stretch>
+                      <a:fillRect/>
+                    </a:stretch>
+                  </pic:blipFill>
+                  <pic:spPr bwMode="auto">
+                    <a:xfrm>
+                      <a:off x="0" y="0"/>
+                      <a:ext cx="2657475" cy="5943600"/>
+                    </a:xfrm>
+                    <a:prstGeom prst="rect">
+                      <a:avLst/>
+                    </a:prstGeom>
+                    <a:noFill/>
+                  </pic:spPr>
+                </pic:pic>
+              </a:graphicData>
+            </a:graphic>
+          </wp:inline>
+        </w:drawing>
+      </w:r>
+    </w:p>
+    <w:p>
+      <w:pPr>
+        <w:pStyle w:val="Normal"/>
+        <w:rPr>
+          <w:b/>
+          <w:bCs/>
+          <w:sz w:val="18"/>
+          <w:szCs w:val="18"/>
+        </w:rPr>
+      </w:pPr>
+      <w:r>
+        <w:rPr>
+          <w:b/>
+          <w:bCs/>
+          <w:sz w:val="18"/>
+          <w:szCs w:val="18"/>
+        </w:rPr>
+        <w:t>Fig 4.3 Home page</w:t>
+      </w:r>
+    </w:p>
+    <w:p>
+      <w:pPr>
+        <w:pStyle w:val="Normal"/>
+        <w:rPr/>
+      </w:pPr>
+      <w:r>
+        <w:rPr/>
       </w:r>
     </w:p>
     <w:p>
@@ -1976,105 +2264,300 @@
         <w:pStyle w:val="Heading2"/>
         <w:rPr/>
       </w:pPr>
-      <w:bookmarkStart w:id="8" w:name="_Toc285706414"/>
-      <w:r>
-        <w:rPr/>
-        <w:t>3.1 Tools/ Software used</w:t>
-      </w:r>
-      <w:bookmarkEnd w:id="8"/>
-    </w:p>
-    <w:p>
-      <w:pPr>
-        <w:pStyle w:val="Normal"/>
-        <w:rPr/>
-      </w:pPr>
-      <w:r>
-        <w:rPr/>
-        <w:t>1.Figma</w:t>
-      </w:r>
-    </w:p>
-    <w:p>
-      <w:pPr>
-        <w:pStyle w:val="Normal"/>
-        <w:rPr/>
-      </w:pPr>
-      <w:r>
-        <w:rPr/>
+      <w:bookmarkStart w:id="9" w:name="_Toc611807717"/>
+      <w:r>
+        <w:rPr/>
+        <w:t>4.1 Personal reflection</w:t>
+      </w:r>
+      <w:bookmarkEnd w:id="9"/>
+    </w:p>
+    <w:p>
+      <w:pPr>
+        <w:pStyle w:val="Normal"/>
+        <w:rPr/>
+      </w:pPr>
+      <w:r>
+        <w:rPr/>
+        <w:t>This week I learned how Expo Router simplifies navigation using file-based routing. Planning screen interactions and reusable components before implementation helped me understand the importance of maintainable application structure and user experience design.</w:t>
+      </w:r>
+    </w:p>
+    <w:p>
+      <w:pPr>
+        <w:pStyle w:val="Normal"/>
+        <w:rPr/>
+      </w:pPr>
+      <w:r>
+        <w:rPr/>
+      </w:r>
+    </w:p>
+    <w:p>
+      <w:pPr>
+        <w:pStyle w:val="Heading1"/>
+        <w:rPr/>
+      </w:pPr>
+      <w:bookmarkStart w:id="10" w:name="_Toc132451714"/>
+      <w:r>
+        <w:rPr/>
+        <w:t>Week 5: Data Management</w:t>
+      </w:r>
+      <w:bookmarkEnd w:id="10"/>
+    </w:p>
+    <w:p>
+      <w:pPr>
+        <w:pStyle w:val="Normal"/>
+        <w:rPr/>
+      </w:pPr>
+      <w:r>
+        <w:rPr/>
+      </w:r>
+    </w:p>
+    <w:p>
+      <w:pPr>
+        <w:pStyle w:val="Normal"/>
+        <w:rPr/>
+      </w:pPr>
+      <w:r>
+        <w:rPr/>
+        <w:drawing>
+          <wp:inline distT="0" distB="0" distL="0" distR="0">
+            <wp:extent cx="2657475" cy="5943600"/>
+            <wp:effectExtent l="0" t="0" r="0" b="0"/>
+            <wp:docPr id="14" name="Image14"/>
+            <wp:cNvGraphicFramePr>
+              <a:graphicFrameLocks xmlns:a="http://schemas.openxmlformats.org/drawingml/2006/main" noChangeAspect="1"/>
+            </wp:cNvGraphicFramePr>
+            <a:graphic xmlns:a="http://schemas.openxmlformats.org/drawingml/2006/main">
+              <a:graphicData uri="http://schemas.openxmlformats.org/drawingml/2006/picture">
+                <pic:pic xmlns:pic="http://schemas.openxmlformats.org/drawingml/2006/picture">
+                  <pic:nvPicPr>
+                    <pic:cNvPr id="14" name="Image14"/>
+                    <pic:cNvPicPr>
+                      <a:picLocks noChangeAspect="1" noChangeArrowheads="1"/>
+                    </pic:cNvPicPr>
+                  </pic:nvPicPr>
+                  <pic:blipFill>
+                    <a:blip r:embed="rId15"/>
+                    <a:stretch>
+                      <a:fillRect/>
+                    </a:stretch>
+                  </pic:blipFill>
+                  <pic:spPr bwMode="auto">
+                    <a:xfrm>
+                      <a:off x="0" y="0"/>
+                      <a:ext cx="2657475" cy="5943600"/>
+                    </a:xfrm>
+                    <a:prstGeom prst="rect">
+                      <a:avLst/>
+                    </a:prstGeom>
+                    <a:noFill/>
+                  </pic:spPr>
+                </pic:pic>
+              </a:graphicData>
+            </a:graphic>
+          </wp:inline>
+        </w:drawing>
+      </w:r>
+    </w:p>
+    <w:p>
+      <w:pPr>
+        <w:pStyle w:val="Normal"/>
+        <w:rPr>
+          <w:b/>
+          <w:bCs/>
+          <w:sz w:val="18"/>
+          <w:szCs w:val="18"/>
+        </w:rPr>
+      </w:pPr>
+      <w:r>
+        <w:rPr>
+          <w:b/>
+          <w:bCs/>
+          <w:sz w:val="18"/>
+          <w:szCs w:val="18"/>
+        </w:rPr>
+        <w:t>Fig 5.0 Services history</w:t>
+      </w:r>
+    </w:p>
+    <w:p>
+      <w:pPr>
+        <w:pStyle w:val="Normal"/>
+        <w:rPr>
+          <w:b/>
+          <w:bCs/>
+          <w:sz w:val="18"/>
+          <w:szCs w:val="18"/>
+        </w:rPr>
+      </w:pPr>
+      <w:r>
+        <w:rPr>
+          <w:b/>
+          <w:bCs/>
+          <w:sz w:val="18"/>
+          <w:szCs w:val="18"/>
+        </w:rPr>
+      </w:r>
+    </w:p>
+    <w:p>
+      <w:pPr>
+        <w:pStyle w:val="Normal"/>
+        <w:rPr>
+          <w:b/>
+          <w:bCs/>
+          <w:sz w:val="18"/>
+          <w:szCs w:val="18"/>
+        </w:rPr>
+      </w:pPr>
+      <w:r>
+        <w:rPr>
+          <w:b/>
+          <w:bCs/>
+          <w:sz w:val="18"/>
+          <w:szCs w:val="18"/>
+        </w:rPr>
+      </w:r>
+    </w:p>
+    <w:p>
+      <w:pPr>
+        <w:pStyle w:val="Normal"/>
+        <w:rPr/>
+      </w:pPr>
+      <w:r>
+        <w:rPr/>
+        <w:drawing>
+          <wp:inline distT="0" distB="0" distL="0" distR="0">
+            <wp:extent cx="2657475" cy="5943600"/>
+            <wp:effectExtent l="0" t="0" r="0" b="0"/>
+            <wp:docPr id="15" name="Image15"/>
+            <wp:cNvGraphicFramePr>
+              <a:graphicFrameLocks xmlns:a="http://schemas.openxmlformats.org/drawingml/2006/main" noChangeAspect="1"/>
+            </wp:cNvGraphicFramePr>
+            <a:graphic xmlns:a="http://schemas.openxmlformats.org/drawingml/2006/main">
+              <a:graphicData uri="http://schemas.openxmlformats.org/drawingml/2006/picture">
+                <pic:pic xmlns:pic="http://schemas.openxmlformats.org/drawingml/2006/picture">
+                  <pic:nvPicPr>
+                    <pic:cNvPr id="15" name="Image15"/>
+                    <pic:cNvPicPr>
+                      <a:picLocks noChangeAspect="1" noChangeArrowheads="1"/>
+                    </pic:cNvPicPr>
+                  </pic:nvPicPr>
+                  <pic:blipFill>
+                    <a:blip r:embed="rId16"/>
+                    <a:stretch>
+                      <a:fillRect/>
+                    </a:stretch>
+                  </pic:blipFill>
+                  <pic:spPr bwMode="auto">
+                    <a:xfrm>
+                      <a:off x="0" y="0"/>
+                      <a:ext cx="2657475" cy="5943600"/>
+                    </a:xfrm>
+                    <a:prstGeom prst="rect">
+                      <a:avLst/>
+                    </a:prstGeom>
+                    <a:noFill/>
+                  </pic:spPr>
+                </pic:pic>
+              </a:graphicData>
+            </a:graphic>
+          </wp:inline>
+        </w:drawing>
+      </w:r>
+    </w:p>
+    <w:p>
+      <w:pPr>
+        <w:pStyle w:val="Normal"/>
+        <w:rPr>
+          <w:b/>
+          <w:bCs/>
+          <w:sz w:val="18"/>
+          <w:szCs w:val="18"/>
+        </w:rPr>
+      </w:pPr>
+      <w:r>
+        <w:rPr>
+          <w:b/>
+          <w:bCs/>
+          <w:sz w:val="18"/>
+          <w:szCs w:val="18"/>
+        </w:rPr>
+        <w:t>Fig 5.1 Service reminders</w:t>
+      </w:r>
+    </w:p>
+    <w:p>
+      <w:pPr>
+        <w:pStyle w:val="Normal"/>
+        <w:rPr>
+          <w:b/>
+          <w:bCs/>
+          <w:sz w:val="18"/>
+          <w:szCs w:val="18"/>
+        </w:rPr>
+      </w:pPr>
+      <w:r>
+        <w:rPr>
+          <w:b/>
+          <w:bCs/>
+          <w:sz w:val="18"/>
+          <w:szCs w:val="18"/>
+        </w:rPr>
       </w:r>
     </w:p>
     <w:p>
       <w:pPr>
         <w:pStyle w:val="Heading2"/>
-        <w:rPr/>
-      </w:pPr>
-      <w:bookmarkStart w:id="9" w:name="_Toc1227389364"/>
-      <w:r>
-        <w:rPr/>
-        <w:t>3.2 Personal reflection</w:t>
-      </w:r>
-      <w:bookmarkEnd w:id="9"/>
-    </w:p>
-    <w:p>
-      <w:pPr>
-        <w:pStyle w:val="Normal"/>
-        <w:rPr/>
-      </w:pPr>
-      <w:r>
-        <w:rPr>
-          <w:rFonts w:eastAsia="Aptos" w:cs="Aptos"/>
-          <w:sz w:val="24"/>
-          <w:szCs w:val="24"/>
-          <w:lang w:val="en-US"/>
-        </w:rPr>
-        <w:t>This week I learned the importance of planning the user interface before development. Creating wireframes in Figma helped me visualize the application structure, improve navigation flow, and identify design improvements before writing code.</w:t>
-      </w:r>
-    </w:p>
-    <w:p>
-      <w:pPr>
-        <w:pStyle w:val="Normal"/>
-        <w:rPr>
-          <w:rFonts w:ascii="Aptos" w:hAnsi="Aptos" w:eastAsia="Aptos" w:cs="Aptos"/>
-          <w:sz w:val="24"/>
-          <w:szCs w:val="24"/>
-          <w:lang w:val="en-US"/>
-        </w:rPr>
-      </w:pPr>
-      <w:r>
-        <w:rPr>
-          <w:rFonts w:eastAsia="Aptos" w:cs="Aptos"/>
-          <w:sz w:val="24"/>
-          <w:szCs w:val="24"/>
-          <w:lang w:val="en-US"/>
-        </w:rPr>
-      </w:r>
-    </w:p>
-    <w:p>
-      <w:pPr>
-        <w:pStyle w:val="Normal"/>
-        <w:spacing w:before="0" w:after="160"/>
-        <w:rPr>
-          <w:rFonts w:ascii="Aptos" w:hAnsi="Aptos" w:eastAsia="Aptos" w:cs="Aptos"/>
-          <w:sz w:val="24"/>
-          <w:szCs w:val="24"/>
-          <w:lang w:val="en-US"/>
-        </w:rPr>
-      </w:pPr>
-      <w:r>
-        <w:rPr>
-          <w:rFonts w:eastAsia="Aptos" w:cs="Aptos"/>
-          <w:sz w:val="24"/>
-          <w:szCs w:val="24"/>
-          <w:lang w:val="en-US"/>
-        </w:rPr>
+        <w:rPr>
+          <w:b/>
+          <w:bCs/>
+          <w:sz w:val="18"/>
+          <w:szCs w:val="18"/>
+        </w:rPr>
+      </w:pPr>
+      <w:bookmarkStart w:id="11" w:name="_Toc1860295451"/>
+      <w:r>
+        <w:rPr/>
+        <w:t>5.1 Personal Reflection</w:t>
+      </w:r>
+      <w:bookmarkEnd w:id="11"/>
+    </w:p>
+    <w:p>
+      <w:pPr>
+        <w:pStyle w:val="Normal"/>
+        <w:rPr/>
+      </w:pPr>
+      <w:r>
+        <w:rPr/>
+        <w:t>This week I learned the importance of organizing and managing data effectively in mobile applications. Planning how vehicle, maintenance, and expense information would be stored helped me understand how proper data management improves accuracy, usability, and decision-making.</w:t>
+      </w:r>
+    </w:p>
+    <w:p>
+      <w:pPr>
+        <w:pStyle w:val="Normal"/>
+        <w:rPr/>
+      </w:pPr>
+      <w:r>
+        <w:rPr/>
+      </w:r>
+    </w:p>
+    <w:p>
+      <w:pPr>
+        <w:pStyle w:val="Normal"/>
+        <w:widowControl/>
+        <w:bidi w:val="0"/>
+        <w:spacing w:lineRule="auto" w:line="278" w:before="0" w:after="160"/>
+        <w:jc w:val="start"/>
+        <w:rPr/>
+      </w:pPr>
+      <w:r>
+        <w:rPr/>
       </w:r>
     </w:p>
     <w:sectPr>
-      <w:headerReference w:type="even" r:id="rId12"/>
-      <w:headerReference w:type="default" r:id="rId13"/>
-      <w:headerReference w:type="first" r:id="rId14"/>
-      <w:footerReference w:type="even" r:id="rId15"/>
-      <w:footerReference w:type="default" r:id="rId16"/>
-      <w:footerReference w:type="first" r:id="rId17"/>
+      <w:headerReference w:type="even" r:id="rId17"/>
+      <w:headerReference w:type="default" r:id="rId18"/>
+      <w:headerReference w:type="first" r:id="rId19"/>
+      <w:footerReference w:type="even" r:id="rId20"/>
+      <w:footerReference w:type="default" r:id="rId21"/>
+      <w:footerReference w:type="first" r:id="rId22"/>
       <w:type w:val="nextPage"/>
       <w:pgSz w:w="12240" w:h="15840"/>
       <w:pgMar w:left="1440" w:right="1440" w:gutter="0" w:header="720" w:top="1440" w:footer="720" w:bottom="1440"/>
@@ -2136,7 +2619,6 @@
           <w:pPr>
             <w:pStyle w:val="Header"/>
             <w:widowControl/>
-            <w:suppressAutoHyphens w:val="true"/>
             <w:bidi w:val="0"/>
             <w:spacing w:before="0" w:after="0"/>
             <w:ind w:start="-115"/>
@@ -2169,7 +2651,6 @@
           <w:pPr>
             <w:pStyle w:val="Header"/>
             <w:widowControl/>
-            <w:suppressAutoHyphens w:val="true"/>
             <w:bidi w:val="0"/>
             <w:spacing w:before="0" w:after="0"/>
             <w:jc w:val="center"/>
@@ -2201,7 +2682,6 @@
           <w:pPr>
             <w:pStyle w:val="Header"/>
             <w:widowControl/>
-            <w:suppressAutoHyphens w:val="true"/>
             <w:bidi w:val="0"/>
             <w:spacing w:before="0" w:after="0"/>
             <w:ind w:end="-115"/>
@@ -2275,7 +2755,6 @@
           <w:pPr>
             <w:pStyle w:val="Header"/>
             <w:widowControl/>
-            <w:suppressAutoHyphens w:val="true"/>
             <w:bidi w:val="0"/>
             <w:spacing w:before="0" w:after="0"/>
             <w:ind w:start="-115"/>
@@ -2308,7 +2787,6 @@
           <w:pPr>
             <w:pStyle w:val="Header"/>
             <w:widowControl/>
-            <w:suppressAutoHyphens w:val="true"/>
             <w:bidi w:val="0"/>
             <w:spacing w:before="0" w:after="0"/>
             <w:jc w:val="center"/>
@@ -2340,7 +2818,6 @@
           <w:pPr>
             <w:pStyle w:val="Header"/>
             <w:widowControl/>
-            <w:suppressAutoHyphens w:val="true"/>
             <w:bidi w:val="0"/>
             <w:spacing w:before="0" w:after="0"/>
             <w:ind w:end="-115"/>
@@ -2428,7 +2905,6 @@
           <w:pPr>
             <w:pStyle w:val="Header"/>
             <w:widowControl/>
-            <w:suppressAutoHyphens w:val="true"/>
             <w:bidi w:val="0"/>
             <w:spacing w:before="0" w:after="0"/>
             <w:ind w:start="-115"/>
@@ -2461,7 +2937,6 @@
           <w:pPr>
             <w:pStyle w:val="Header"/>
             <w:widowControl/>
-            <w:suppressAutoHyphens w:val="true"/>
             <w:bidi w:val="0"/>
             <w:spacing w:before="0" w:after="0"/>
             <w:jc w:val="center"/>
@@ -2493,7 +2968,6 @@
           <w:pPr>
             <w:pStyle w:val="Header"/>
             <w:widowControl/>
-            <w:suppressAutoHyphens w:val="true"/>
             <w:bidi w:val="0"/>
             <w:spacing w:before="0" w:after="0"/>
             <w:ind w:end="-115"/>
@@ -2567,7 +3041,6 @@
           <w:pPr>
             <w:pStyle w:val="Header"/>
             <w:widowControl/>
-            <w:suppressAutoHyphens w:val="true"/>
             <w:bidi w:val="0"/>
             <w:spacing w:before="0" w:after="0"/>
             <w:ind w:start="-115"/>
@@ -2600,7 +3073,6 @@
           <w:pPr>
             <w:pStyle w:val="Header"/>
             <w:widowControl/>
-            <w:suppressAutoHyphens w:val="true"/>
             <w:bidi w:val="0"/>
             <w:spacing w:before="0" w:after="0"/>
             <w:jc w:val="center"/>
@@ -2632,7 +3104,6 @@
           <w:pPr>
             <w:pStyle w:val="Header"/>
             <w:widowControl/>
-            <w:suppressAutoHyphens w:val="true"/>
             <w:bidi w:val="0"/>
             <w:spacing w:before="0" w:after="0"/>
             <w:ind w:end="-115"/>
@@ -3066,7 +3537,6 @@
     <w:qFormat/>
     <w:pPr>
       <w:widowControl/>
-      <w:suppressAutoHyphens w:val="true"/>
       <w:bidi w:val="0"/>
       <w:spacing w:lineRule="auto" w:line="278" w:before="0" w:after="160"/>
       <w:jc w:val="start"/>
@@ -3142,18 +3612,12 @@
   </w:style>
   <w:style w:type="character" w:styleId="FootnoteCharacters">
     <w:name w:val="Footnote Characters"/>
+    <w:basedOn w:val="DefaultParagraphFont"/>
     <w:uiPriority w:val="99"/>
     <w:semiHidden/>
     <w:unhideWhenUsed/>
     <w:qFormat/>
     <w:rsid w:val="7bb627b8"/>
-    <w:rPr>
-      <w:vertAlign w:val="superscript"/>
-    </w:rPr>
-  </w:style>
-  <w:style w:type="character" w:styleId="FootnoteCharactersuser">
-    <w:name w:val="Footnote Characters (user)"/>
-    <w:qFormat/>
     <w:rPr>
       <w:vertAlign w:val="superscript"/>
     </w:rPr>

</xml_diff>